<commit_message>
Quitar un import debugpy para que el plugin ejecute sin necesidad de modificar python, lo que requeriría (pip install debugpy)
</commit_message>
<xml_diff>
--- a/documentos/20260419 Instalación de QGIS4 y SWM-3D.docx
+++ b/documentos/20260419 Instalación de QGIS4 y SWM-3D.docx
@@ -59,11 +59,11 @@
     </w:p>
     <w:p>
       <w:r>
-        <w:t>En la instalación de QGIS4 y del pluggi</w:t>
+        <w:t xml:space="preserve">En la instalación de QGIS4 y del </w:t>
       </w:r>
       <w:proofErr w:type="spellStart"/>
       <w:r>
-        <w:t>n</w:t>
+        <w:t>pluggin</w:t>
       </w:r>
       <w:proofErr w:type="spellEnd"/>
       <w:r>
@@ -244,33 +244,7 @@
           <w:lang w:eastAsia="es-ES"/>
           <w14:ligatures w14:val="none"/>
         </w:rPr>
-        <w:t>La s</w:t>
-      </w:r>
-      <w:r>
-        <w:rPr>
-          <w:rFonts w:ascii="Segoe UI" w:eastAsia="Times New Roman" w:hAnsi="Segoe UI" w:cs="Segoe UI"/>
-          <w:b/>
-          <w:bCs/>
-          <w:kern w:val="36"/>
-          <w:sz w:val="36"/>
-          <w:szCs w:val="36"/>
-          <w:lang w:eastAsia="es-ES"/>
-          <w14:ligatures w14:val="none"/>
-        </w:rPr>
-        <w:t xml:space="preserve">olución correcta OFICIAL y </w:t>
-      </w:r>
-      <w:r>
-        <w:rPr>
-          <w:rFonts w:ascii="Segoe UI" w:eastAsia="Times New Roman" w:hAnsi="Segoe UI" w:cs="Segoe UI"/>
-          <w:b/>
-          <w:bCs/>
-          <w:kern w:val="36"/>
-          <w:sz w:val="36"/>
-          <w:szCs w:val="36"/>
-          <w:lang w:eastAsia="es-ES"/>
-          <w14:ligatures w14:val="none"/>
-        </w:rPr>
-        <w:t>más limpia</w:t>
+        <w:t>La solución correcta OFICIAL y más limpia</w:t>
       </w:r>
     </w:p>
     <w:p>
@@ -318,18 +292,7 @@
           <w:lang w:eastAsia="es-ES"/>
           <w14:ligatures w14:val="none"/>
         </w:rPr>
-        <w:t xml:space="preserve"> ni forzar </w:t>
-      </w:r>
-      <w:r>
-        <w:rPr>
-          <w:rFonts w:ascii="Segoe UI" w:eastAsia="Times New Roman" w:hAnsi="Segoe UI" w:cs="Segoe UI"/>
-          <w:kern w:val="0"/>
-          <w:sz w:val="21"/>
-          <w:szCs w:val="21"/>
-          <w:lang w:eastAsia="es-ES"/>
-          <w14:ligatures w14:val="none"/>
-        </w:rPr>
-        <w:t xml:space="preserve">los </w:t>
+        <w:t xml:space="preserve"> ni forzar los </w:t>
       </w:r>
       <w:proofErr w:type="spellStart"/>
       <w:r>
@@ -353,18 +316,7 @@
           <w:lang w:eastAsia="es-ES"/>
           <w14:ligatures w14:val="none"/>
         </w:rPr>
-        <w:t xml:space="preserve"> ni desinstalar manualmente nada de lo que se ha creado durante la instalación OSGEO. Se confía en que esta instalación es adecuada o se corregirá en breve. Si tocamos algo, podemos impedir futuras actualizaciones</w:t>
-      </w:r>
-      <w:r>
-        <w:rPr>
-          <w:rFonts w:ascii="Segoe UI" w:eastAsia="Times New Roman" w:hAnsi="Segoe UI" w:cs="Segoe UI"/>
-          <w:kern w:val="0"/>
-          <w:sz w:val="21"/>
-          <w:szCs w:val="21"/>
-          <w:lang w:eastAsia="es-ES"/>
-          <w14:ligatures w14:val="none"/>
-        </w:rPr>
-        <w:t>.</w:t>
+        <w:t xml:space="preserve"> ni desinstalar manualmente nada de lo que se ha creado durante la instalación OSGEO. Se confía en que esta instalación es adecuada o se corregirá en breve. Si tocamos algo, podemos impedir futuras actualizaciones.</w:t>
       </w:r>
       <w:r>
         <w:rPr>
@@ -479,109 +431,60 @@
           <w:sz w:val="21"/>
           <w:szCs w:val="21"/>
         </w:rPr>
-        <w:t>Instal</w:t>
-      </w:r>
+        <w:t xml:space="preserve">Instalar </w:t>
+      </w:r>
+      <w:r>
+        <w:rPr>
+          <w:rFonts w:ascii="Segoe UI" w:eastAsia="Times New Roman" w:hAnsi="Segoe UI" w:cs="Segoe UI"/>
+          <w:sz w:val="21"/>
+          <w:szCs w:val="21"/>
+        </w:rPr>
+        <w:t xml:space="preserve">QGIS 4.0.x </w:t>
+      </w:r>
+      <w:proofErr w:type="spellStart"/>
+      <w:r>
+        <w:rPr>
+          <w:rFonts w:ascii="Segoe UI" w:eastAsia="Times New Roman" w:hAnsi="Segoe UI" w:cs="Segoe UI"/>
+          <w:sz w:val="21"/>
+          <w:szCs w:val="21"/>
+        </w:rPr>
+        <w:t>standalone</w:t>
+      </w:r>
+      <w:proofErr w:type="spellEnd"/>
       <w:r>
         <w:rPr>
           <w:rFonts w:ascii="Segoe UI" w:hAnsi="Segoe UI" w:cs="Segoe UI"/>
           <w:sz w:val="21"/>
           <w:szCs w:val="21"/>
         </w:rPr>
-        <w:t xml:space="preserve">ar </w:t>
-      </w:r>
-      <w:r>
-        <w:rPr>
-          <w:rFonts w:ascii="Segoe UI" w:eastAsia="Times New Roman" w:hAnsi="Segoe UI" w:cs="Segoe UI"/>
-          <w:sz w:val="21"/>
-          <w:szCs w:val="21"/>
-        </w:rPr>
-        <w:t xml:space="preserve">QGIS 4.0.x </w:t>
-      </w:r>
-      <w:proofErr w:type="spellStart"/>
-      <w:r>
-        <w:rPr>
-          <w:rFonts w:ascii="Segoe UI" w:eastAsia="Times New Roman" w:hAnsi="Segoe UI" w:cs="Segoe UI"/>
-          <w:sz w:val="21"/>
-          <w:szCs w:val="21"/>
-        </w:rPr>
-        <w:t>standalone</w:t>
-      </w:r>
-      <w:proofErr w:type="spellEnd"/>
+        <w:t xml:space="preserve"> (instalador oficial </w:t>
+      </w:r>
+      <w:r>
+        <w:rPr>
+          <w:rFonts w:ascii="Segoe UI" w:eastAsia="Times New Roman" w:hAnsi="Segoe UI" w:cs="Segoe UI"/>
+          <w:sz w:val="21"/>
+          <w:szCs w:val="21"/>
+        </w:rPr>
+        <w:t>.exe</w:t>
+      </w:r>
       <w:r>
         <w:rPr>
           <w:rFonts w:ascii="Segoe UI" w:hAnsi="Segoe UI" w:cs="Segoe UI"/>
           <w:sz w:val="21"/>
           <w:szCs w:val="21"/>
         </w:rPr>
-        <w:t xml:space="preserve"> (instalador oficial </w:t>
-      </w:r>
-      <w:r>
-        <w:rPr>
-          <w:rFonts w:ascii="Segoe UI" w:eastAsia="Times New Roman" w:hAnsi="Segoe UI" w:cs="Segoe UI"/>
-          <w:sz w:val="21"/>
-          <w:szCs w:val="21"/>
-        </w:rPr>
-        <w:t>.exe</w:t>
-      </w:r>
-      <w:r>
-        <w:rPr>
-          <w:rFonts w:ascii="Segoe UI" w:hAnsi="Segoe UI" w:cs="Segoe UI"/>
-          <w:sz w:val="21"/>
-          <w:szCs w:val="21"/>
-        </w:rPr>
-        <w:t>)</w:t>
-      </w:r>
-      <w:r>
-        <w:rPr>
-          <w:rFonts w:ascii="Segoe UI" w:hAnsi="Segoe UI" w:cs="Segoe UI"/>
-          <w:sz w:val="21"/>
-          <w:szCs w:val="21"/>
-        </w:rPr>
-        <w:t>, que es t</w:t>
-      </w:r>
-      <w:r>
-        <w:rPr>
-          <w:rFonts w:ascii="Segoe UI" w:eastAsia="Times New Roman" w:hAnsi="Segoe UI" w:cs="Segoe UI"/>
-          <w:kern w:val="0"/>
-          <w:sz w:val="21"/>
-          <w:szCs w:val="21"/>
-          <w:lang w:eastAsia="es-ES"/>
-          <w14:ligatures w14:val="none"/>
-        </w:rPr>
-        <w:t>otalmente funcional</w:t>
-      </w:r>
-      <w:r>
-        <w:rPr>
-          <w:rFonts w:ascii="Segoe UI" w:eastAsia="Times New Roman" w:hAnsi="Segoe UI" w:cs="Segoe UI"/>
-          <w:kern w:val="0"/>
-          <w:sz w:val="21"/>
-          <w:szCs w:val="21"/>
-          <w:lang w:eastAsia="es-ES"/>
-          <w14:ligatures w14:val="none"/>
-        </w:rPr>
-        <w:t xml:space="preserve">, con </w:t>
-      </w:r>
-      <w:r>
-        <w:rPr>
-          <w:rFonts w:ascii="Segoe UI" w:eastAsia="Times New Roman" w:hAnsi="Segoe UI" w:cs="Segoe UI"/>
-          <w:kern w:val="0"/>
-          <w:sz w:val="21"/>
-          <w:szCs w:val="21"/>
-          <w:lang w:eastAsia="es-ES"/>
-          <w14:ligatures w14:val="none"/>
-        </w:rPr>
-        <w:t>Qt6 bien configurado</w:t>
-      </w:r>
-      <w:r>
-        <w:rPr>
-          <w:rFonts w:ascii="Segoe UI" w:eastAsia="Times New Roman" w:hAnsi="Segoe UI" w:cs="Segoe UI"/>
-          <w:kern w:val="0"/>
-          <w:sz w:val="21"/>
-          <w:szCs w:val="21"/>
-          <w:lang w:eastAsia="es-ES"/>
-          <w14:ligatures w14:val="none"/>
-        </w:rPr>
-        <w:t xml:space="preserve"> y </w:t>
+        <w:t>), que es t</w:t>
+      </w:r>
+      <w:r>
+        <w:rPr>
+          <w:rFonts w:ascii="Segoe UI" w:eastAsia="Times New Roman" w:hAnsi="Segoe UI" w:cs="Segoe UI"/>
+          <w:kern w:val="0"/>
+          <w:sz w:val="21"/>
+          <w:szCs w:val="21"/>
+          <w:lang w:eastAsia="es-ES"/>
+          <w14:ligatures w14:val="none"/>
+        </w:rPr>
+        <w:t xml:space="preserve">otalmente funcional, con Qt6 bien configurado y </w:t>
       </w:r>
       <w:r>
         <w:rPr>
@@ -636,31 +539,7 @@
           <w:lang w:eastAsia="es-ES"/>
           <w14:ligatures w14:val="none"/>
         </w:rPr>
-        <w:t xml:space="preserve"> ya que se trabaja completamente por separado. Esperar a la siguiente versión de OSGeo4W más consolidada y, cuando ya </w:t>
-      </w:r>
-      <w:proofErr w:type="gramStart"/>
-      <w:r>
-        <w:rPr>
-          <w:rFonts w:ascii="Segoe UI" w:eastAsia="Times New Roman" w:hAnsi="Segoe UI" w:cs="Segoe UI"/>
-          <w:kern w:val="0"/>
-          <w:sz w:val="21"/>
-          <w:szCs w:val="21"/>
-          <w:lang w:eastAsia="es-ES"/>
-          <w14:ligatures w14:val="none"/>
-        </w:rPr>
-        <w:t>maneje</w:t>
-      </w:r>
-      <w:proofErr w:type="gramEnd"/>
-      <w:r>
-        <w:rPr>
-          <w:rFonts w:ascii="Segoe UI" w:eastAsia="Times New Roman" w:hAnsi="Segoe UI" w:cs="Segoe UI"/>
-          <w:kern w:val="0"/>
-          <w:sz w:val="21"/>
-          <w:szCs w:val="21"/>
-          <w:lang w:eastAsia="es-ES"/>
-          <w14:ligatures w14:val="none"/>
-        </w:rPr>
-        <w:t xml:space="preserve"> bien una versión DEV en QGIS4, desinstalar la versión </w:t>
+        <w:t xml:space="preserve"> ya que se trabaja completamente por separado. Esperar a la siguiente versión de OSGeo4W más consolidada y, cuando ya maneje bien una versión DEV en QGIS4, desinstalar la versión </w:t>
       </w:r>
       <w:proofErr w:type="spellStart"/>
       <w:r>
@@ -1145,10 +1024,10 @@
             <v:path o:extrusionok="f" gradientshapeok="t" o:connecttype="rect"/>
             <o:lock v:ext="edit" aspectratio="t"/>
           </v:shapetype>
-          <v:shape id="_x0000_i1036" type="#_x0000_t75" style="width:336pt;height:112.5pt" o:ole="">
+          <v:shape id="_x0000_i1025" type="#_x0000_t75" style="width:336pt;height:112.8pt" o:ole="">
             <v:imagedata r:id="rId5" o:title=""/>
           </v:shape>
-          <o:OLEObject Type="Embed" ProgID="Unknown" ShapeID="_x0000_i1036" DrawAspect="Content" ObjectID="_1838207257" r:id="rId6"/>
+          <o:OLEObject Type="Embed" ProgID="Unknown" ShapeID="_x0000_i1025" DrawAspect="Content" ObjectID="_1838810873" r:id="rId6"/>
         </w:object>
       </w:r>
     </w:p>
@@ -1550,31 +1429,7 @@
           <w:lang w:eastAsia="es-ES"/>
           <w14:ligatures w14:val="none"/>
         </w:rPr>
-        <w:t xml:space="preserve">, </w:t>
-      </w:r>
-      <w:proofErr w:type="gramStart"/>
-      <w:r>
-        <w:rPr>
-          <w:rFonts w:ascii="Segoe UI" w:eastAsia="Times New Roman" w:hAnsi="Segoe UI" w:cs="Segoe UI"/>
-          <w:kern w:val="0"/>
-          <w:sz w:val="21"/>
-          <w:szCs w:val="21"/>
-          <w:lang w:eastAsia="es-ES"/>
-          <w14:ligatures w14:val="none"/>
-        </w:rPr>
-        <w:t>como</w:t>
-      </w:r>
-      <w:proofErr w:type="gramEnd"/>
-      <w:r>
-        <w:rPr>
-          <w:rFonts w:ascii="Segoe UI" w:eastAsia="Times New Roman" w:hAnsi="Segoe UI" w:cs="Segoe UI"/>
-          <w:kern w:val="0"/>
-          <w:sz w:val="21"/>
-          <w:szCs w:val="21"/>
-          <w:lang w:eastAsia="es-ES"/>
-          <w14:ligatures w14:val="none"/>
-        </w:rPr>
-        <w:t xml:space="preserve"> por ejemplo </w:t>
+        <w:t xml:space="preserve">, como por ejemplo </w:t>
       </w:r>
     </w:p>
     <w:p>
@@ -1869,7 +1724,6 @@
         <w:t>print(</w:t>
       </w:r>
       <w:proofErr w:type="spellStart"/>
-      <w:proofErr w:type="gramStart"/>
       <w:r>
         <w:rPr>
           <w:rFonts w:ascii="Segoe UI" w:eastAsia="Times New Roman" w:hAnsi="Segoe UI" w:cs="Segoe UI"/>
@@ -1882,7 +1736,6 @@
         <w:t>sys.executable</w:t>
       </w:r>
       <w:proofErr w:type="spellEnd"/>
-      <w:proofErr w:type="gramEnd"/>
       <w:r>
         <w:rPr>
           <w:rFonts w:ascii="Segoe UI" w:eastAsia="Times New Roman" w:hAnsi="Segoe UI" w:cs="Segoe UI"/>
@@ -1904,10 +1757,21 @@
           <w:kern w:val="0"/>
           <w:sz w:val="21"/>
           <w:szCs w:val="21"/>
-          <w:lang w:eastAsia="es-ES"/>
-          <w14:ligatures w14:val="none"/>
-        </w:rPr>
-      </w:pPr>
+          <w:lang w:val="en-US" w:eastAsia="es-ES"/>
+          <w14:ligatures w14:val="none"/>
+        </w:rPr>
+      </w:pPr>
+      <w:r>
+        <w:rPr>
+          <w:rFonts w:ascii="Segoe UI" w:eastAsia="Times New Roman" w:hAnsi="Segoe UI" w:cs="Segoe UI"/>
+          <w:kern w:val="0"/>
+          <w:sz w:val="21"/>
+          <w:szCs w:val="21"/>
+          <w:lang w:val="en-US" w:eastAsia="es-ES"/>
+          <w14:ligatures w14:val="none"/>
+        </w:rPr>
+        <w:t>print(</w:t>
+      </w:r>
       <w:proofErr w:type="spellStart"/>
       <w:r>
         <w:rPr>
@@ -1915,10 +1779,10 @@
           <w:kern w:val="0"/>
           <w:sz w:val="21"/>
           <w:szCs w:val="21"/>
-          <w:lang w:eastAsia="es-ES"/>
-          <w14:ligatures w14:val="none"/>
-        </w:rPr>
-        <w:t>print</w:t>
+          <w:lang w:val="en-US" w:eastAsia="es-ES"/>
+          <w14:ligatures w14:val="none"/>
+        </w:rPr>
+        <w:t>sys.version</w:t>
       </w:r>
       <w:proofErr w:type="spellEnd"/>
       <w:r>
@@ -1927,33 +1791,7 @@
           <w:kern w:val="0"/>
           <w:sz w:val="21"/>
           <w:szCs w:val="21"/>
-          <w:lang w:eastAsia="es-ES"/>
-          <w14:ligatures w14:val="none"/>
-        </w:rPr>
-        <w:t>(</w:t>
-      </w:r>
-      <w:proofErr w:type="spellStart"/>
-      <w:proofErr w:type="gramStart"/>
-      <w:r>
-        <w:rPr>
-          <w:rFonts w:ascii="Segoe UI" w:eastAsia="Times New Roman" w:hAnsi="Segoe UI" w:cs="Segoe UI"/>
-          <w:kern w:val="0"/>
-          <w:sz w:val="21"/>
-          <w:szCs w:val="21"/>
-          <w:lang w:eastAsia="es-ES"/>
-          <w14:ligatures w14:val="none"/>
-        </w:rPr>
-        <w:t>sys.version</w:t>
-      </w:r>
-      <w:proofErr w:type="spellEnd"/>
-      <w:proofErr w:type="gramEnd"/>
-      <w:r>
-        <w:rPr>
-          <w:rFonts w:ascii="Segoe UI" w:eastAsia="Times New Roman" w:hAnsi="Segoe UI" w:cs="Segoe UI"/>
-          <w:kern w:val="0"/>
-          <w:sz w:val="21"/>
-          <w:szCs w:val="21"/>
-          <w:lang w:eastAsia="es-ES"/>
+          <w:lang w:val="en-US" w:eastAsia="es-ES"/>
           <w14:ligatures w14:val="none"/>
         </w:rPr>
         <w:t>)</w:t>
@@ -2273,6 +2111,196 @@
           <w:kern w:val="0"/>
           <w:sz w:val="21"/>
           <w:szCs w:val="21"/>
+          <w:lang w:eastAsia="es-ES"/>
+          <w14:ligatures w14:val="none"/>
+        </w:rPr>
+      </w:pPr>
+      <w:r>
+        <w:rPr>
+          <w:rFonts w:ascii="Segoe UI" w:eastAsia="Times New Roman" w:hAnsi="Segoe UI" w:cs="Segoe UI"/>
+          <w:kern w:val="0"/>
+          <w:sz w:val="21"/>
+          <w:szCs w:val="21"/>
+          <w:lang w:eastAsia="es-ES"/>
+          <w14:ligatures w14:val="none"/>
+        </w:rPr>
+        <w:t>venv-qgis4-dev\Scripts\</w:t>
+      </w:r>
+      <w:proofErr w:type="spellStart"/>
+      <w:r>
+        <w:rPr>
+          <w:rFonts w:ascii="Segoe UI" w:eastAsia="Times New Roman" w:hAnsi="Segoe UI" w:cs="Segoe UI"/>
+          <w:kern w:val="0"/>
+          <w:sz w:val="21"/>
+          <w:szCs w:val="21"/>
+          <w:lang w:eastAsia="es-ES"/>
+          <w14:ligatures w14:val="none"/>
+        </w:rPr>
+        <w:t>activate</w:t>
+      </w:r>
+      <w:proofErr w:type="spellEnd"/>
+    </w:p>
+    <w:p>
+      <w:pPr>
+        <w:rPr>
+          <w:rFonts w:ascii="Segoe UI" w:eastAsia="Times New Roman" w:hAnsi="Segoe UI" w:cs="Segoe UI"/>
+          <w:kern w:val="0"/>
+          <w:sz w:val="21"/>
+          <w:szCs w:val="21"/>
+          <w:lang w:eastAsia="es-ES"/>
+          <w14:ligatures w14:val="none"/>
+        </w:rPr>
+      </w:pPr>
+      <w:r>
+        <w:rPr>
+          <w:rFonts w:ascii="Segoe UI" w:eastAsia="Times New Roman" w:hAnsi="Segoe UI" w:cs="Segoe UI"/>
+          <w:kern w:val="0"/>
+          <w:sz w:val="21"/>
+          <w:szCs w:val="21"/>
+          <w:lang w:eastAsia="es-ES"/>
+          <w14:ligatures w14:val="none"/>
+        </w:rPr>
+        <w:t>o seleccionarlo desde el co</w:t>
+      </w:r>
+      <w:r>
+        <w:rPr>
+          <w:rFonts w:ascii="Segoe UI" w:eastAsia="Times New Roman" w:hAnsi="Segoe UI" w:cs="Segoe UI"/>
+          <w:kern w:val="0"/>
+          <w:sz w:val="21"/>
+          <w:szCs w:val="21"/>
+          <w:lang w:eastAsia="es-ES"/>
+          <w14:ligatures w14:val="none"/>
+        </w:rPr>
+        <w:t>mpilador que se utilice.</w:t>
+      </w:r>
+    </w:p>
+    <w:p>
+      <w:pPr>
+        <w:rPr>
+          <w:rFonts w:ascii="Segoe UI" w:eastAsia="Times New Roman" w:hAnsi="Segoe UI" w:cs="Segoe UI"/>
+          <w:kern w:val="0"/>
+          <w:sz w:val="21"/>
+          <w:szCs w:val="21"/>
+          <w:lang w:eastAsia="es-ES"/>
+          <w14:ligatures w14:val="none"/>
+        </w:rPr>
+      </w:pPr>
+      <w:r>
+        <w:rPr>
+          <w:rFonts w:ascii="Segoe UI" w:eastAsia="Times New Roman" w:hAnsi="Segoe UI" w:cs="Segoe UI"/>
+          <w:kern w:val="0"/>
+          <w:sz w:val="21"/>
+          <w:szCs w:val="21"/>
+          <w:lang w:eastAsia="es-ES"/>
+          <w14:ligatures w14:val="none"/>
+        </w:rPr>
+        <w:t xml:space="preserve">Para poder hacer </w:t>
+      </w:r>
+      <w:proofErr w:type="spellStart"/>
+      <w:r>
+        <w:rPr>
+          <w:rFonts w:ascii="Segoe UI" w:eastAsia="Times New Roman" w:hAnsi="Segoe UI" w:cs="Segoe UI"/>
+          <w:kern w:val="0"/>
+          <w:sz w:val="21"/>
+          <w:szCs w:val="21"/>
+          <w:lang w:eastAsia="es-ES"/>
+          <w14:ligatures w14:val="none"/>
+        </w:rPr>
+        <w:t>debug</w:t>
+      </w:r>
+      <w:proofErr w:type="spellEnd"/>
+      <w:r>
+        <w:rPr>
+          <w:rFonts w:ascii="Segoe UI" w:eastAsia="Times New Roman" w:hAnsi="Segoe UI" w:cs="Segoe UI"/>
+          <w:kern w:val="0"/>
+          <w:sz w:val="21"/>
+          <w:szCs w:val="21"/>
+          <w:lang w:eastAsia="es-ES"/>
+          <w14:ligatures w14:val="none"/>
+        </w:rPr>
+        <w:t xml:space="preserve"> en este modo desarrollo hay que </w:t>
+      </w:r>
+      <w:proofErr w:type="spellStart"/>
+      <w:r>
+        <w:rPr>
+          <w:rFonts w:ascii="Segoe UI" w:eastAsia="Times New Roman" w:hAnsi="Segoe UI" w:cs="Segoe UI"/>
+          <w:kern w:val="0"/>
+          <w:sz w:val="21"/>
+          <w:szCs w:val="21"/>
+          <w:lang w:eastAsia="es-ES"/>
+          <w14:ligatures w14:val="none"/>
+        </w:rPr>
+        <w:t>intalar</w:t>
+      </w:r>
+      <w:proofErr w:type="spellEnd"/>
+      <w:r>
+        <w:rPr>
+          <w:rFonts w:ascii="Segoe UI" w:eastAsia="Times New Roman" w:hAnsi="Segoe UI" w:cs="Segoe UI"/>
+          <w:kern w:val="0"/>
+          <w:sz w:val="21"/>
+          <w:szCs w:val="21"/>
+          <w:lang w:eastAsia="es-ES"/>
+          <w14:ligatures w14:val="none"/>
+        </w:rPr>
+        <w:t xml:space="preserve"> la librería </w:t>
+      </w:r>
+      <w:proofErr w:type="spellStart"/>
+      <w:r>
+        <w:rPr>
+          <w:rFonts w:ascii="Segoe UI" w:eastAsia="Times New Roman" w:hAnsi="Segoe UI" w:cs="Segoe UI"/>
+          <w:kern w:val="0"/>
+          <w:sz w:val="21"/>
+          <w:szCs w:val="21"/>
+          <w:lang w:eastAsia="es-ES"/>
+          <w14:ligatures w14:val="none"/>
+        </w:rPr>
+        <w:t>debugpy</w:t>
+      </w:r>
+      <w:proofErr w:type="spellEnd"/>
+      <w:r>
+        <w:rPr>
+          <w:rFonts w:ascii="Segoe UI" w:eastAsia="Times New Roman" w:hAnsi="Segoe UI" w:cs="Segoe UI"/>
+          <w:kern w:val="0"/>
+          <w:sz w:val="21"/>
+          <w:szCs w:val="21"/>
+          <w:lang w:eastAsia="es-ES"/>
+          <w14:ligatures w14:val="none"/>
+        </w:rPr>
+        <w:t xml:space="preserve"> en el </w:t>
+      </w:r>
+      <w:proofErr w:type="spellStart"/>
+      <w:r>
+        <w:rPr>
+          <w:rFonts w:ascii="Segoe UI" w:eastAsia="Times New Roman" w:hAnsi="Segoe UI" w:cs="Segoe UI"/>
+          <w:kern w:val="0"/>
+          <w:sz w:val="21"/>
+          <w:szCs w:val="21"/>
+          <w:lang w:eastAsia="es-ES"/>
+          <w14:ligatures w14:val="none"/>
+        </w:rPr>
+        <w:t>environment</w:t>
+      </w:r>
+      <w:proofErr w:type="spellEnd"/>
+      <w:r>
+        <w:rPr>
+          <w:rFonts w:ascii="Segoe UI" w:eastAsia="Times New Roman" w:hAnsi="Segoe UI" w:cs="Segoe UI"/>
+          <w:kern w:val="0"/>
+          <w:sz w:val="21"/>
+          <w:szCs w:val="21"/>
+          <w:lang w:eastAsia="es-ES"/>
+          <w14:ligatures w14:val="none"/>
+        </w:rPr>
+        <w:t xml:space="preserve"> anterior:</w:t>
+      </w:r>
+    </w:p>
+    <w:p>
+      <w:pPr>
+        <w:ind w:firstLine="708"/>
+        <w:rPr>
+          <w:rFonts w:ascii="Segoe UI" w:eastAsia="Times New Roman" w:hAnsi="Segoe UI" w:cs="Segoe UI"/>
+          <w:kern w:val="0"/>
+          <w:sz w:val="21"/>
+          <w:szCs w:val="21"/>
           <w:lang w:val="en-US" w:eastAsia="es-ES"/>
           <w14:ligatures w14:val="none"/>
         </w:rPr>
@@ -2286,54 +2314,135 @@
           <w:lang w:val="en-US" w:eastAsia="es-ES"/>
           <w14:ligatures w14:val="none"/>
         </w:rPr>
-        <w:t>venv-qgis4-dev\Scripts\activate</w:t>
-      </w:r>
-    </w:p>
-    <w:p>
-      <w:pPr>
-        <w:rPr>
-          <w:rFonts w:ascii="Segoe UI" w:eastAsia="Times New Roman" w:hAnsi="Segoe UI" w:cs="Segoe UI"/>
-          <w:kern w:val="0"/>
-          <w:sz w:val="21"/>
-          <w:szCs w:val="21"/>
-          <w:lang w:eastAsia="es-ES"/>
-          <w14:ligatures w14:val="none"/>
-        </w:rPr>
-      </w:pPr>
-      <w:r>
-        <w:rPr>
-          <w:rFonts w:ascii="Segoe UI" w:eastAsia="Times New Roman" w:hAnsi="Segoe UI" w:cs="Segoe UI"/>
-          <w:kern w:val="0"/>
-          <w:sz w:val="21"/>
-          <w:szCs w:val="21"/>
-          <w:lang w:eastAsia="es-ES"/>
-          <w14:ligatures w14:val="none"/>
-        </w:rPr>
-        <w:t>o seleccionarlo desde el co</w:t>
-      </w:r>
-      <w:r>
-        <w:rPr>
-          <w:rFonts w:ascii="Segoe UI" w:eastAsia="Times New Roman" w:hAnsi="Segoe UI" w:cs="Segoe UI"/>
-          <w:kern w:val="0"/>
-          <w:sz w:val="21"/>
-          <w:szCs w:val="21"/>
-          <w:lang w:eastAsia="es-ES"/>
-          <w14:ligatures w14:val="none"/>
-        </w:rPr>
-        <w:t>mpilador que se utilice.</w:t>
-      </w:r>
-    </w:p>
-    <w:p>
-      <w:pPr>
-        <w:rPr>
-          <w:rFonts w:ascii="Segoe UI" w:eastAsia="Times New Roman" w:hAnsi="Segoe UI" w:cs="Segoe UI"/>
-          <w:kern w:val="0"/>
-          <w:sz w:val="21"/>
-          <w:szCs w:val="21"/>
-          <w:lang w:eastAsia="es-ES"/>
-          <w14:ligatures w14:val="none"/>
-        </w:rPr>
-      </w:pPr>
+        <w:t xml:space="preserve">python -m pip install --upgrade </w:t>
+      </w:r>
+      <w:proofErr w:type="spellStart"/>
+      <w:r>
+        <w:rPr>
+          <w:rFonts w:ascii="Segoe UI" w:eastAsia="Times New Roman" w:hAnsi="Segoe UI" w:cs="Segoe UI"/>
+          <w:kern w:val="0"/>
+          <w:sz w:val="21"/>
+          <w:szCs w:val="21"/>
+          <w:lang w:val="en-US" w:eastAsia="es-ES"/>
+          <w14:ligatures w14:val="none"/>
+        </w:rPr>
+        <w:t>debugpy</w:t>
+      </w:r>
+      <w:proofErr w:type="spellEnd"/>
+    </w:p>
+    <w:p>
+      <w:pPr>
+        <w:rPr>
+          <w:rFonts w:ascii="Segoe UI" w:eastAsia="Times New Roman" w:hAnsi="Segoe UI" w:cs="Segoe UI"/>
+          <w:kern w:val="0"/>
+          <w:sz w:val="21"/>
+          <w:szCs w:val="21"/>
+          <w:lang w:eastAsia="es-ES"/>
+          <w14:ligatures w14:val="none"/>
+        </w:rPr>
+      </w:pPr>
+      <w:r>
+        <w:rPr>
+          <w:rFonts w:ascii="Segoe UI" w:eastAsia="Times New Roman" w:hAnsi="Segoe UI" w:cs="Segoe UI"/>
+          <w:kern w:val="0"/>
+          <w:sz w:val="21"/>
+          <w:szCs w:val="21"/>
+          <w:lang w:eastAsia="es-ES"/>
+          <w14:ligatures w14:val="none"/>
+        </w:rPr>
+        <w:t xml:space="preserve">Instrucciones </w:t>
+      </w:r>
+      <w:proofErr w:type="spellStart"/>
+      <w:r>
+        <w:rPr>
+          <w:rFonts w:ascii="Segoe UI" w:eastAsia="Times New Roman" w:hAnsi="Segoe UI" w:cs="Segoe UI"/>
+          <w:kern w:val="0"/>
+          <w:sz w:val="21"/>
+          <w:szCs w:val="21"/>
+          <w:lang w:eastAsia="es-ES"/>
+          <w14:ligatures w14:val="none"/>
+        </w:rPr>
+        <w:t>generals</w:t>
+      </w:r>
+      <w:proofErr w:type="spellEnd"/>
+      <w:r>
+        <w:rPr>
+          <w:rFonts w:ascii="Segoe UI" w:eastAsia="Times New Roman" w:hAnsi="Segoe UI" w:cs="Segoe UI"/>
+          <w:kern w:val="0"/>
+          <w:sz w:val="21"/>
+          <w:szCs w:val="21"/>
+          <w:lang w:eastAsia="es-ES"/>
+          <w14:ligatures w14:val="none"/>
+        </w:rPr>
+        <w:t xml:space="preserve"> m</w:t>
+      </w:r>
+      <w:r>
+        <w:rPr>
+          <w:rFonts w:ascii="Segoe UI" w:eastAsia="Times New Roman" w:hAnsi="Segoe UI" w:cs="Segoe UI"/>
+          <w:kern w:val="0"/>
+          <w:sz w:val="21"/>
+          <w:szCs w:val="21"/>
+          <w:lang w:eastAsia="es-ES"/>
+          <w14:ligatures w14:val="none"/>
+        </w:rPr>
+        <w:t>á</w:t>
+      </w:r>
+      <w:r>
+        <w:rPr>
+          <w:rFonts w:ascii="Segoe UI" w:eastAsia="Times New Roman" w:hAnsi="Segoe UI" w:cs="Segoe UI"/>
+          <w:kern w:val="0"/>
+          <w:sz w:val="21"/>
+          <w:szCs w:val="21"/>
+          <w:lang w:eastAsia="es-ES"/>
+          <w14:ligatures w14:val="none"/>
+        </w:rPr>
+        <w:t>s de</w:t>
+      </w:r>
+      <w:r>
+        <w:rPr>
+          <w:rFonts w:ascii="Segoe UI" w:eastAsia="Times New Roman" w:hAnsi="Segoe UI" w:cs="Segoe UI"/>
+          <w:kern w:val="0"/>
+          <w:sz w:val="21"/>
+          <w:szCs w:val="21"/>
+          <w:lang w:eastAsia="es-ES"/>
+          <w14:ligatures w14:val="none"/>
+        </w:rPr>
+        <w:t>talladas en :</w:t>
+      </w:r>
+    </w:p>
+    <w:p>
+      <w:pPr>
+        <w:rPr>
+          <w:rFonts w:ascii="Segoe UI" w:eastAsia="Times New Roman" w:hAnsi="Segoe UI" w:cs="Segoe UI"/>
+          <w:kern w:val="0"/>
+          <w:sz w:val="21"/>
+          <w:szCs w:val="21"/>
+          <w:lang w:eastAsia="es-ES"/>
+          <w14:ligatures w14:val="none"/>
+        </w:rPr>
+      </w:pPr>
+      <w:r>
+        <w:rPr>
+          <w:rFonts w:ascii="Segoe UI" w:eastAsia="Times New Roman" w:hAnsi="Segoe UI" w:cs="Segoe UI"/>
+          <w:kern w:val="0"/>
+          <w:sz w:val="21"/>
+          <w:szCs w:val="21"/>
+          <w:lang w:eastAsia="es-ES"/>
+          <w14:ligatures w14:val="none"/>
+        </w:rPr>
+        <w:tab/>
+      </w:r>
+      <w:r>
+        <w:rPr>
+          <w:rFonts w:ascii="Segoe UI" w:eastAsia="Times New Roman" w:hAnsi="Segoe UI" w:cs="Segoe UI"/>
+          <w:kern w:val="0"/>
+          <w:sz w:val="21"/>
+          <w:szCs w:val="21"/>
+          <w:lang w:eastAsia="es-ES"/>
+          <w14:ligatures w14:val="none"/>
+        </w:rPr>
+        <w:t>https://code.visualstudio.com/docs/python/debugging</w:t>
+      </w:r>
     </w:p>
     <w:p>
       <w:pPr>

</xml_diff>